<commit_message>
docs: add technical appendix and GitHub repository reference to technical review report
</commit_message>
<xml_diff>
--- a/reports/technical_review_report.docx
+++ b/reports/technical_review_report.docx
@@ -252,6 +252,59 @@
                 <w:sz w:val="18"/>
               </w:rPr>
               <w:t>Duan, J., Gong, Y., Luo, J., &amp; Zhao, Z. (2023). Scientific Reports, 13:12127.</w:t>
+            </w:r>
+          </w:p>
+        </w:tc>
+      </w:tr>
+      <w:tr>
+        <w:tc>
+          <w:tcPr>
+            <w:tcW w:type="dxa" w:w="3168"/>
+            <w:shd w:fill="F7FAFC"/>
+            <w:tcMar>
+              <w:top w:w="50" w:type="dxa"/>
+              <w:bottom w:w="50" w:type="dxa"/>
+              <w:left w:w="80" w:type="dxa"/>
+              <w:right w:w="80" w:type="dxa"/>
+            </w:tcMar>
+          </w:tcPr>
+          <w:p>
+            <w:pPr>
+              <w:spacing w:after="20"/>
+            </w:pPr>
+            <w:r>
+              <w:rPr>
+                <w:rFonts w:ascii="Arial" w:hAnsi="Arial"/>
+                <w:b/>
+                <w:color w:val="1B365D"/>
+                <w:sz w:val="18"/>
+              </w:rPr>
+              <w:t>GitHub Repository:</w:t>
+            </w:r>
+          </w:p>
+        </w:tc>
+        <w:tc>
+          <w:tcPr>
+            <w:tcW w:type="dxa" w:w="6624"/>
+            <w:shd w:fill="FFFFFF"/>
+            <w:tcMar>
+              <w:top w:w="50" w:type="dxa"/>
+              <w:bottom w:w="50" w:type="dxa"/>
+              <w:left w:w="80" w:type="dxa"/>
+              <w:right w:w="80" w:type="dxa"/>
+            </w:tcMar>
+          </w:tcPr>
+          <w:p>
+            <w:pPr>
+              <w:spacing w:after="20"/>
+            </w:pPr>
+            <w:r>
+              <w:rPr>
+                <w:rFonts w:ascii="Arial" w:hAnsi="Arial"/>
+                <w:color w:val="2D3748"/>
+                <w:sz w:val="18"/>
+              </w:rPr>
+              <w:t>https://github.com/chathuradinal/Air-quality-model</w:t>
             </w:r>
           </w:p>
         </w:tc>
@@ -9119,6 +9172,457 @@
         <w:t>Xue, J., &amp; Shen, B. (2022). Dung beetle optimizer: A new meta-heuristic algorithm for global optimization. The Journal of Supercomputing, 79(7), 7305–7348. https://doi.org/10.1007/s11227-022-04959-6</w:t>
       </w:r>
     </w:p>
+    <w:p>
+      <w:pPr>
+        <w:keepNext/>
+        <w:spacing w:before="320" w:after="100"/>
+      </w:pPr>
+      <w:r>
+        <w:rPr>
+          <w:rFonts w:ascii="Arial" w:hAnsi="Arial"/>
+          <w:b/>
+          <w:color w:val="1B365D"/>
+          <w:sz w:val="26"/>
+        </w:rPr>
+        <w:t>10. Technical Appendix: Reproducibility, GitHub Repository &amp; Execution Guide</w:t>
+      </w:r>
+    </w:p>
+    <w:p>
+      <w:pPr>
+        <w:keepNext/>
+        <w:spacing w:before="220" w:after="60"/>
+      </w:pPr>
+      <w:r>
+        <w:rPr>
+          <w:rFonts w:ascii="Arial" w:hAnsi="Arial"/>
+          <w:b/>
+          <w:color w:val="2B6CB0"/>
+          <w:sz w:val="22"/>
+        </w:rPr>
+        <w:t>10.1 GitHub Repository &amp; Source Code Access</w:t>
+      </w:r>
+    </w:p>
+    <w:p>
+      <w:pPr>
+        <w:spacing w:before="0" w:after="100" w:line="276" w:lineRule="auto"/>
+      </w:pPr>
+      <w:r>
+        <w:rPr>
+          <w:rFonts w:ascii="Calibri" w:hAnsi="Calibri"/>
+          <w:i w:val="0"/>
+          <w:color w:val="2D3748"/>
+          <w:sz w:val="20"/>
+        </w:rPr>
+        <w:t>The complete source code, interactive Jupyter notebooks, preprocessed datasets, and document generation scripts are hosted on GitHub at:</w:t>
+      </w:r>
+    </w:p>
+    <w:p>
+      <w:pPr>
+        <w:spacing w:before="0" w:after="100" w:line="276" w:lineRule="auto"/>
+      </w:pPr>
+      <w:r>
+        <w:rPr>
+          <w:rFonts w:ascii="Calibri" w:hAnsi="Calibri"/>
+          <w:b/>
+          <w:color w:val="1B365D"/>
+          <w:sz w:val="20"/>
+        </w:rPr>
+        <w:t xml:space="preserve">Repository URL: </w:t>
+      </w:r>
+      <w:r>
+        <w:rPr>
+          <w:rFonts w:ascii="Calibri" w:hAnsi="Calibri"/>
+          <w:i w:val="0"/>
+          <w:color w:val="2D3748"/>
+          <w:sz w:val="20"/>
+        </w:rPr>
+        <w:t>https://github.com/chathuradinal/Air-quality-model</w:t>
+      </w:r>
+    </w:p>
+    <w:p>
+      <w:pPr>
+        <w:spacing w:before="0" w:after="100" w:line="276" w:lineRule="auto"/>
+      </w:pPr>
+      <w:r>
+        <w:rPr>
+          <w:rFonts w:ascii="Calibri" w:hAnsi="Calibri"/>
+          <w:b/>
+          <w:color w:val="1B365D"/>
+          <w:sz w:val="20"/>
+        </w:rPr>
+        <w:t xml:space="preserve">Student Author: </w:t>
+      </w:r>
+      <w:r>
+        <w:rPr>
+          <w:rFonts w:ascii="Calibri" w:hAnsi="Calibri"/>
+          <w:i w:val="0"/>
+          <w:color w:val="2D3748"/>
+          <w:sz w:val="20"/>
+        </w:rPr>
+        <w:t>K.W.G.C.D.B. Karunarathne (Student ID: KIC-BSCCSAI-251P-036)</w:t>
+      </w:r>
+    </w:p>
+    <w:p>
+      <w:pPr>
+        <w:spacing w:before="0" w:after="100" w:line="276" w:lineRule="auto"/>
+      </w:pPr>
+      <w:r>
+        <w:rPr>
+          <w:rFonts w:ascii="Calibri" w:hAnsi="Calibri"/>
+          <w:b/>
+          <w:color w:val="1B365D"/>
+          <w:sz w:val="20"/>
+        </w:rPr>
+        <w:t xml:space="preserve">Default Branch: </w:t>
+      </w:r>
+      <w:r>
+        <w:rPr>
+          <w:rFonts w:ascii="Calibri" w:hAnsi="Calibri"/>
+          <w:i w:val="0"/>
+          <w:color w:val="2D3748"/>
+          <w:sz w:val="20"/>
+        </w:rPr>
+        <w:t>main</w:t>
+      </w:r>
+    </w:p>
+    <w:p>
+      <w:pPr>
+        <w:keepNext/>
+        <w:spacing w:before="220" w:after="60"/>
+      </w:pPr>
+      <w:r>
+        <w:rPr>
+          <w:rFonts w:ascii="Arial" w:hAnsi="Arial"/>
+          <w:b/>
+          <w:color w:val="2B6CB0"/>
+          <w:sz w:val="22"/>
+        </w:rPr>
+        <w:t>10.2 System Requirements &amp; Environment Setup</w:t>
+      </w:r>
+    </w:p>
+    <w:p>
+      <w:pPr>
+        <w:spacing w:before="0" w:after="100" w:line="276" w:lineRule="auto"/>
+      </w:pPr>
+      <w:r>
+        <w:rPr>
+          <w:rFonts w:ascii="Calibri" w:hAnsi="Calibri"/>
+          <w:i w:val="0"/>
+          <w:color w:val="2D3748"/>
+          <w:sz w:val="20"/>
+        </w:rPr>
+        <w:t>1. Clone repository: git clone https://github.com/chathuradinal/Air-quality-model.git</w:t>
+      </w:r>
+    </w:p>
+    <w:p>
+      <w:pPr>
+        <w:spacing w:before="0" w:after="100" w:line="276" w:lineRule="auto"/>
+      </w:pPr>
+      <w:r>
+        <w:rPr>
+          <w:rFonts w:ascii="Calibri" w:hAnsi="Calibri"/>
+          <w:i w:val="0"/>
+          <w:color w:val="2D3748"/>
+          <w:sz w:val="20"/>
+        </w:rPr>
+        <w:t>2. Setup virtual environment: python3 -m venv venv &amp;&amp; source venv/bin/activate</w:t>
+      </w:r>
+    </w:p>
+    <w:p>
+      <w:pPr>
+        <w:spacing w:before="0" w:after="100" w:line="276" w:lineRule="auto"/>
+      </w:pPr>
+      <w:r>
+        <w:rPr>
+          <w:rFonts w:ascii="Calibri" w:hAnsi="Calibri"/>
+          <w:i w:val="0"/>
+          <w:color w:val="2D3748"/>
+          <w:sz w:val="20"/>
+        </w:rPr>
+        <w:t>3. Install dependencies: pip install -r requirements.txt (PyTorch, statsmodels, scikit-learn, reportlab, python-docx, matplotlib, pymupdf)</w:t>
+      </w:r>
+    </w:p>
+    <w:p>
+      <w:pPr>
+        <w:keepNext/>
+        <w:spacing w:before="220" w:after="60"/>
+      </w:pPr>
+      <w:r>
+        <w:rPr>
+          <w:rFonts w:ascii="Arial" w:hAnsi="Arial"/>
+          <w:b/>
+          <w:color w:val="2B6CB0"/>
+          <w:sz w:val="22"/>
+        </w:rPr>
+        <w:t>10.3 How to Run the Code</w:t>
+      </w:r>
+    </w:p>
+    <w:p>
+      <w:pPr>
+        <w:spacing w:before="0" w:after="100" w:line="276" w:lineRule="auto"/>
+      </w:pPr>
+      <w:r>
+        <w:rPr>
+          <w:rFonts w:ascii="Calibri" w:hAnsi="Calibri"/>
+          <w:b/>
+          <w:color w:val="1B365D"/>
+          <w:sz w:val="20"/>
+        </w:rPr>
+        <w:t xml:space="preserve">• </w:t>
+      </w:r>
+      <w:r>
+        <w:rPr>
+          <w:rFonts w:ascii="Calibri" w:hAnsi="Calibri"/>
+          <w:i w:val="0"/>
+          <w:color w:val="2D3748"/>
+          <w:sz w:val="20"/>
+        </w:rPr>
+        <w:t>Running Base Model Replication (Paper Replication):</w:t>
+      </w:r>
+    </w:p>
+    <w:p>
+      <w:pPr>
+        <w:spacing w:before="0" w:after="100" w:line="276" w:lineRule="auto"/>
+      </w:pPr>
+      <w:r>
+        <w:rPr>
+          <w:rFonts w:ascii="Calibri" w:hAnsi="Calibri"/>
+          <w:i w:val="0"/>
+          <w:color w:val="2D3748"/>
+          <w:sz w:val="20"/>
+        </w:rPr>
+        <w:t>Via Jupyter Notebook: Open notebooks/phase1_base_replication.ipynb and execute all cells.</w:t>
+      </w:r>
+    </w:p>
+    <w:p>
+      <w:pPr>
+        <w:spacing w:before="0" w:after="100" w:line="276" w:lineRule="auto"/>
+      </w:pPr>
+      <w:r>
+        <w:rPr>
+          <w:rFonts w:ascii="Calibri" w:hAnsi="Calibri"/>
+          <w:i w:val="0"/>
+          <w:color w:val="2D3748"/>
+          <w:sz w:val="20"/>
+        </w:rPr>
+        <w:t>Via CLI: python main.py --city beijing  (or python run_all_cities.py for all 4 cities).</w:t>
+      </w:r>
+    </w:p>
+    <w:p>
+      <w:pPr>
+        <w:spacing w:before="0" w:after="100" w:line="276" w:lineRule="auto"/>
+      </w:pPr>
+      <w:r>
+        <w:rPr>
+          <w:rFonts w:ascii="Calibri" w:hAnsi="Calibri"/>
+          <w:b/>
+          <w:color w:val="1B365D"/>
+          <w:sz w:val="20"/>
+        </w:rPr>
+        <w:t xml:space="preserve">• </w:t>
+      </w:r>
+      <w:r>
+        <w:rPr>
+          <w:rFonts w:ascii="Calibri" w:hAnsi="Calibri"/>
+          <w:i w:val="0"/>
+          <w:color w:val="2D3748"/>
+          <w:sz w:val="20"/>
+        </w:rPr>
+        <w:t>Running Enhanced Model &amp; Empirical Audit:</w:t>
+      </w:r>
+    </w:p>
+    <w:p>
+      <w:pPr>
+        <w:spacing w:before="0" w:after="100" w:line="276" w:lineRule="auto"/>
+      </w:pPr>
+      <w:r>
+        <w:rPr>
+          <w:rFonts w:ascii="Calibri" w:hAnsi="Calibri"/>
+          <w:i w:val="0"/>
+          <w:color w:val="2D3748"/>
+          <w:sz w:val="20"/>
+        </w:rPr>
+        <w:t>Via Jupyter Notebook: Open notebooks/phase2_enhanced_study.ipynb and execute all cells.</w:t>
+      </w:r>
+    </w:p>
+    <w:p>
+      <w:pPr>
+        <w:spacing w:before="0" w:after="100" w:line="276" w:lineRule="auto"/>
+      </w:pPr>
+      <w:r>
+        <w:rPr>
+          <w:rFonts w:ascii="Calibri" w:hAnsi="Calibri"/>
+          <w:i w:val="0"/>
+          <w:color w:val="2D3748"/>
+          <w:sz w:val="20"/>
+        </w:rPr>
+        <w:t>Via CLI: python run_phase2_experiments.py (executes 3-way split, persistence baseline, GBDT, DM tests, and peak breakdown).</w:t>
+      </w:r>
+    </w:p>
+    <w:p>
+      <w:pPr>
+        <w:spacing w:before="0" w:after="100" w:line="276" w:lineRule="auto"/>
+      </w:pPr>
+      <w:r>
+        <w:rPr>
+          <w:rFonts w:ascii="Calibri" w:hAnsi="Calibri"/>
+          <w:b/>
+          <w:color w:val="1B365D"/>
+          <w:sz w:val="20"/>
+        </w:rPr>
+        <w:t xml:space="preserve">• </w:t>
+      </w:r>
+      <w:r>
+        <w:rPr>
+          <w:rFonts w:ascii="Calibri" w:hAnsi="Calibri"/>
+          <w:i w:val="0"/>
+          <w:color w:val="2D3748"/>
+          <w:sz w:val="20"/>
+        </w:rPr>
+        <w:t>Recompiling Coursework Report Documents:</w:t>
+      </w:r>
+    </w:p>
+    <w:p>
+      <w:pPr>
+        <w:spacing w:before="0" w:after="100" w:line="276" w:lineRule="auto"/>
+      </w:pPr>
+      <w:r>
+        <w:rPr>
+          <w:rFonts w:ascii="Calibri" w:hAnsi="Calibri"/>
+          <w:i w:val="0"/>
+          <w:color w:val="2D3748"/>
+          <w:sz w:val="20"/>
+        </w:rPr>
+        <w:t>Execute: python src/build_documents.py (recompiles reports/technical_review_report.pdf and reports/technical_review_report.docx).</w:t>
+      </w:r>
+    </w:p>
+    <w:p>
+      <w:pPr>
+        <w:keepNext/>
+        <w:spacing w:before="220" w:after="60"/>
+      </w:pPr>
+      <w:r>
+        <w:rPr>
+          <w:rFonts w:ascii="Arial" w:hAnsi="Arial"/>
+          <w:b/>
+          <w:color w:val="2B6CB0"/>
+          <w:sz w:val="22"/>
+        </w:rPr>
+        <w:t>10.4 Repository Code Structure &amp; Module Guide</w:t>
+      </w:r>
+    </w:p>
+    <w:p>
+      <w:pPr>
+        <w:spacing w:before="0" w:after="100" w:line="276" w:lineRule="auto"/>
+      </w:pPr>
+      <w:r>
+        <w:rPr>
+          <w:rFonts w:ascii="Calibri" w:hAnsi="Calibri"/>
+          <w:i w:val="0"/>
+          <w:color w:val="2D3748"/>
+          <w:sz w:val="20"/>
+        </w:rPr>
+        <w:t>src/data_loader.py: Ingestion, linear interpolation, 80/20 and 3-way split logic.</w:t>
+      </w:r>
+    </w:p>
+    <w:p>
+      <w:pPr>
+        <w:spacing w:before="0" w:after="100" w:line="276" w:lineRule="auto"/>
+      </w:pPr>
+      <w:r>
+        <w:rPr>
+          <w:rFonts w:ascii="Calibri" w:hAnsi="Calibri"/>
+          <w:i w:val="0"/>
+          <w:color w:val="2D3748"/>
+          <w:sz w:val="20"/>
+        </w:rPr>
+        <w:t>src/arima_module.py: Box-Jenkins ARIMA fitting, BIC search, residual extraction.</w:t>
+      </w:r>
+    </w:p>
+    <w:p>
+      <w:pPr>
+        <w:spacing w:before="0" w:after="100" w:line="276" w:lineRule="auto"/>
+      </w:pPr>
+      <w:r>
+        <w:rPr>
+          <w:rFonts w:ascii="Calibri" w:hAnsi="Calibri"/>
+          <w:i w:val="0"/>
+          <w:color w:val="2D3748"/>
+          <w:sz w:val="20"/>
+        </w:rPr>
+        <w:t>src/cnn_lstm_module.py: PyTorch Conv1D + multi-layer LSTM neural network.</w:t>
+      </w:r>
+    </w:p>
+    <w:p>
+      <w:pPr>
+        <w:spacing w:before="0" w:after="100" w:line="276" w:lineRule="auto"/>
+      </w:pPr>
+      <w:r>
+        <w:rPr>
+          <w:rFonts w:ascii="Calibri" w:hAnsi="Calibri"/>
+          <w:i w:val="0"/>
+          <w:color w:val="2D3748"/>
+          <w:sz w:val="20"/>
+        </w:rPr>
+        <w:t>src/dbo_optimizer.py: Pure NumPy Dung Beetle Optimizer (4 phenotypes).</w:t>
+      </w:r>
+    </w:p>
+    <w:p>
+      <w:pPr>
+        <w:spacing w:before="0" w:after="100" w:line="276" w:lineRule="auto"/>
+      </w:pPr>
+      <w:r>
+        <w:rPr>
+          <w:rFonts w:ascii="Calibri" w:hAnsi="Calibri"/>
+          <w:i w:val="0"/>
+          <w:color w:val="2D3748"/>
+          <w:sz w:val="20"/>
+        </w:rPr>
+        <w:t>src/hybrid_model.py: End-to-end ARIMA-DBO-CNN-LSTM combination model.</w:t>
+      </w:r>
+    </w:p>
+    <w:p>
+      <w:pPr>
+        <w:spacing w:before="0" w:after="100" w:line="276" w:lineRule="auto"/>
+      </w:pPr>
+      <w:r>
+        <w:rPr>
+          <w:rFonts w:ascii="Calibri" w:hAnsi="Calibri"/>
+          <w:i w:val="0"/>
+          <w:color w:val="2D3748"/>
+          <w:sz w:val="20"/>
+        </w:rPr>
+        <w:t>src/baselines.py: Naive persistence, GBDT, Random Forest, SVM, LSTM.</w:t>
+      </w:r>
+    </w:p>
+    <w:p>
+      <w:pPr>
+        <w:spacing w:before="0" w:after="100" w:line="276" w:lineRule="auto"/>
+      </w:pPr>
+      <w:r>
+        <w:rPr>
+          <w:rFonts w:ascii="Calibri" w:hAnsi="Calibri"/>
+          <w:i w:val="0"/>
+          <w:color w:val="2D3748"/>
+          <w:sz w:val="20"/>
+        </w:rPr>
+        <w:t>src/evaluation.py: RMSE, MAE, R², MAPE, MASE, peak errors, DM tests.</w:t>
+      </w:r>
+    </w:p>
+    <w:p>
+      <w:pPr>
+        <w:spacing w:before="0" w:after="100" w:line="276" w:lineRule="auto"/>
+      </w:pPr>
+      <w:r>
+        <w:rPr>
+          <w:rFonts w:ascii="Calibri" w:hAnsi="Calibri"/>
+          <w:i w:val="0"/>
+          <w:color w:val="2D3748"/>
+          <w:sz w:val="20"/>
+        </w:rPr>
+        <w:t>src/build_documents.py: Automated builder for Word and PDF reports.</w:t>
+      </w:r>
+    </w:p>
     <w:sectPr>
       <w:pgSz w:w="12240" w:h="15840"/>
       <w:pgMar w:top="1008" w:right="1080" w:bottom="1008" w:left="1080" w:header="720" w:footer="720" w:gutter="0"/>

</xml_diff>